<commit_message>
Document encadrante : explication du filtre de la seconde passe reecrite (comparaison QCM, etapes)
Co-Authored-By: Claude Opus 5.5 <noreply@anthropic.com>
Claude-Session: https://claude.ai/code/session_01U1N2aa47apfcVip95LQDuG
</commit_message>
<xml_diff>
--- a/memoire/TRACE_reduction_hallucinations_explication.docx
+++ b/memoire/TRACE_reduction_hallucinations_explication.docx
@@ -1624,15 +1624,62 @@
       </w:r>
     </w:p>
     <w:p>
-      <w:pPr/>
-      <w:r>
-        <w:rPr>
-          <w:b/>
-        </w:rPr>
-        <w:t xml:space="preserve">Le filtre, et pourquoi il garde des entités mais aucune relation ajoutée.</w:t>
-      </w:r>
-      <w:r>
-        <w:t xml:space="preserve"> Un ajout n'est utile que s'il est juste assez souvent ; sinon, il apporte plus d'erreurs que de réponses justes et le résultat global se dégrade. Cette règle du seuil d'ajout est expliquée en détail au temps 6.</w:t>
+      <w:pPr>
+        <w:pStyle w:val="Heading4"/>
+      </w:pPr>
+      <w:r>
+        <w:t xml:space="preserve">Le filtre : pourquoi on garde certaines entités ajoutées, mais aucune relation ajoutée</w:t>
+      </w:r>
+    </w:p>
+    <w:p>
+      <w:pPr/>
+      <w:r>
+        <w:rPr>
+          <w:b/>
+        </w:rPr>
+        <w:t xml:space="preserve">D'abord, de quoi parle-t-on.</w:t>
+      </w:r>
+      <w:r>
+        <w:t xml:space="preserve"> La seconde passe propose des </w:t>
+      </w:r>
+      <w:r>
+        <w:rPr>
+          <w:b/>
+        </w:rPr>
+        <w:t xml:space="preserve">ajouts</w:t>
+      </w:r>
+      <w:r>
+        <w:t xml:space="preserve"> : des entités et des relations que l'extraction initiale n'avait pas. Le filtre décide quels ajouts entrent dans le graphe. Il ne touche </w:t>
+      </w:r>
+      <w:r>
+        <w:rPr>
+          <w:b/>
+        </w:rPr>
+        <w:t xml:space="preserve">jamais</w:t>
+      </w:r>
+      <w:r>
+        <w:t xml:space="preserve"> à l'extraction initiale : toutes ses entités et toutes ses relations sont conservées et passent dans la suite de TRACE.</w:t>
+      </w:r>
+    </w:p>
+    <w:p>
+      <w:pPr/>
+      <w:r>
+        <w:rPr>
+          <w:b/>
+        </w:rPr>
+        <w:t xml:space="preserve">Une comparaison : le QCM à points négatifs.</w:t>
+      </w:r>
+      <w:r>
+        <w:t xml:space="preserve"> Dans un QCM où une bonne réponse rapporte des points et une mauvaise en fait perdre, un étudiant prudent ne répond que s'il est </w:t>
+      </w:r>
+      <w:r>
+        <w:rPr>
+          <w:b/>
+        </w:rPr>
+        <w:t xml:space="preserve">assez sûr</w:t>
+      </w:r>
+      <w:r>
+        <w:t xml:space="preserve">. S'il répond au hasard, il perd plus qu'il ne gagne. Les ajouts de la seconde passe fonctionnent de la même façon :</w:t>
       </w:r>
     </w:p>
     <w:p>
@@ -1644,16 +1691,16 @@
         </w:numPr>
       </w:pPr>
       <w:r>
-        <w:t xml:space="preserve">Pour les </w:t>
-      </w:r>
-      <w:r>
-        <w:rPr>
-          <w:b/>
-        </w:rPr>
-        <w:t xml:space="preserve">entités</w:t>
-      </w:r>
-      <w:r>
-        <w:t xml:space="preserve">, certains types (micro-organismes, traitements, biomarqueurs, évolution) sont assez souvent justes quand ils reviennent dans toutes les réponses du modèle et ne sont pas niés. Ils sont gardés. Une entité proposée indépendamment par deux passes différentes est aussi plus souvent juste, et elle est gardée pour certains types.</w:t>
+        <w:t xml:space="preserve">un ajout </w:t>
+      </w:r>
+      <w:r>
+        <w:rPr>
+          <w:b/>
+        </w:rPr>
+        <w:t xml:space="preserve">juste</w:t>
+      </w:r>
+      <w:r>
+        <w:t xml:space="preserve"> rapporte : le graphe trouve une information de plus ;</w:t>
       </w:r>
     </w:p>
     <w:p>
@@ -1665,46 +1712,169 @@
         </w:numPr>
       </w:pPr>
       <w:r>
-        <w:t xml:space="preserve">Pour les </w:t>
-      </w:r>
-      <w:r>
-        <w:rPr>
-          <w:b/>
-        </w:rPr>
-        <w:t xml:space="preserve">relations</w:t>
-      </w:r>
-      <w:r>
-        <w:t xml:space="preserve">, aucun groupe n'atteint le seuil, quel que soit le critère regardé : type de relation, nombre de votes, distance entre les termes, ancrage dans le texte. Les relations ajoutées relient presque toujours deux entités réelles par un lien plausible que le texte n'écrit pas (une coloscopie reliée à une sinusite, une HTA présentée comme cause d'un choc septique). Les ajouter fait baisser la qualité du graphe sur chaque moitié du corpus. Elles sont donc toutes écartées.</w:t>
-      </w:r>
-    </w:p>
-    <w:p>
-      <w:pPr/>
-      <w:r>
-        <w:rPr>
-          <w:b/>
-        </w:rPr>
-        <w:t xml:space="preserve">Ce qu'il faut bien comprendre.</w:t>
-      </w:r>
-      <w:r>
-        <w:t xml:space="preserve"> Les relations de l'extraction initiale sont </w:t>
-      </w:r>
-      <w:r>
-        <w:rPr>
-          <w:b/>
-        </w:rPr>
-        <w:t xml:space="preserve">toutes conservées</w:t>
-      </w:r>
-      <w:r>
-        <w:t xml:space="preserve"> et passent dans la suite de TRACE. Seules les relations </w:t>
-      </w:r>
-      <w:r>
-        <w:rPr>
-          <w:b/>
-        </w:rPr>
-        <w:t xml:space="preserve">ajoutées par la seconde passe</w:t>
-      </w:r>
-      <w:r>
-        <w:t xml:space="preserve"> sont écartées. Ce n'est pas un choix fait d'avance : c'est le résultat d'une mesure, obtenu avec la même règle que celle qui a fait garder certaines entités.</w:t>
+        <w:t xml:space="preserve">un ajout </w:t>
+      </w:r>
+      <w:r>
+        <w:rPr>
+          <w:b/>
+        </w:rPr>
+        <w:t xml:space="preserve">faux</w:t>
+      </w:r>
+      <w:r>
+        <w:t xml:space="preserve"> coûte : le graphe contient une hallucination de plus.</w:t>
+      </w:r>
+    </w:p>
+    <w:p>
+      <w:pPr/>
+      <w:r>
+        <w:t xml:space="preserve">Un ajout ne vaut donc la peine que s'il est juste </w:t>
+      </w:r>
+      <w:r>
+        <w:rPr>
+          <w:b/>
+        </w:rPr>
+        <w:t xml:space="preserve">assez souvent</w:t>
+      </w:r>
+      <w:r>
+        <w:t xml:space="preserve">. En dessous, il fait perdre plus qu'il ne fait gagner. Ce niveau minimal s'appelle ici le </w:t>
+      </w:r>
+      <w:r>
+        <w:rPr>
+          <w:b/>
+        </w:rPr>
+        <w:t xml:space="preserve">seuil d'ajout</w:t>
+      </w:r>
+      <w:r>
+        <w:t xml:space="preserve"> ; il est expliqué au temps 6.</w:t>
+      </w:r>
+    </w:p>
+    <w:p>
+      <w:pPr/>
+      <w:r>
+        <w:rPr>
+          <w:b/>
+        </w:rPr>
+        <w:t xml:space="preserve">Comment le filtre décide, étape par étape.</w:t>
+      </w:r>
+    </w:p>
+    <w:p>
+      <w:pPr>
+        <w:pStyle w:val="ListParagraph"/>
+        <w:numPr>
+          <w:ilvl w:val="0"/>
+          <w:numId w:val="7"/>
+        </w:numPr>
+      </w:pPr>
+      <w:r>
+        <w:t xml:space="preserve">On range les ajouts par groupes : par type d'entité ou de relation, selon que le modèle les a proposés dans toutes ses réponses ou seulement dans certaines, selon la distance entre les termes, etc.</w:t>
+      </w:r>
+    </w:p>
+    <w:p>
+      <w:pPr>
+        <w:pStyle w:val="ListParagraph"/>
+        <w:numPr>
+          <w:ilvl w:val="0"/>
+          <w:numId w:val="7"/>
+        </w:numPr>
+      </w:pPr>
+      <w:r>
+        <w:t xml:space="preserve">Pour chaque groupe, on regarde si ses ajouts sont justes assez souvent pour dépasser le seuil.</w:t>
+      </w:r>
+    </w:p>
+    <w:p>
+      <w:pPr>
+        <w:pStyle w:val="ListParagraph"/>
+        <w:numPr>
+          <w:ilvl w:val="0"/>
+          <w:numId w:val="7"/>
+        </w:numPr>
+      </w:pPr>
+      <w:r>
+        <w:t xml:space="preserve">On fait cette vérification sur deux moitiés du corpus, séparément. Un groupe n'est accepté que s'il dépasse le seuil </w:t>
+      </w:r>
+      <w:r>
+        <w:rPr>
+          <w:b/>
+        </w:rPr>
+        <w:t xml:space="preserve">sur les deux</w:t>
+      </w:r>
+      <w:r>
+        <w:t xml:space="preserve"> : sinon, c'était peut-être de la chance.</w:t>
+      </w:r>
+    </w:p>
+    <w:p>
+      <w:pPr>
+        <w:pStyle w:val="ListParagraph"/>
+        <w:numPr>
+          <w:ilvl w:val="0"/>
+          <w:numId w:val="7"/>
+        </w:numPr>
+      </w:pPr>
+      <w:r>
+        <w:t xml:space="preserve">Les groupes acceptés entrent dans le graphe ; les autres sont écartés.</w:t>
+      </w:r>
+    </w:p>
+    <w:p>
+      <w:pPr/>
+      <w:r>
+        <w:rPr>
+          <w:b/>
+        </w:rPr>
+        <w:t xml:space="preserve">Ce que ça donne pour les entités.</w:t>
+      </w:r>
+      <w:r>
+        <w:t xml:space="preserve"> Certains groupes passent le seuil sur les deux moitiés : par exemple les micro-organismes, traitements, biomarqueurs et éléments d'évolution que le modèle a proposés dans </w:t>
+      </w:r>
+      <w:r>
+        <w:rPr>
+          <w:b/>
+        </w:rPr>
+        <w:t xml:space="preserve">toutes</w:t>
+      </w:r>
+      <w:r>
+        <w:t xml:space="preserve"> ses réponses et qui ne sont pas niés. Ce sont des éléments concrets, écrits tels quels dans le texte, que le modèle retrouve de façon stable. Ils sont gardés. Une entité proposée aussi par une seconde passe indépendante passe également le seuil pour certains types, et elle est gardée. Les autres entités ajoutées sont écartées.</w:t>
+      </w:r>
+    </w:p>
+    <w:p>
+      <w:pPr/>
+      <w:r>
+        <w:rPr>
+          <w:b/>
+        </w:rPr>
+        <w:t xml:space="preserve">Ce que ça donne pour les relations.</w:t>
+      </w:r>
+      <w:r>
+        <w:t xml:space="preserve"> On a regardé tous les groupes possibles. </w:t>
+      </w:r>
+      <w:r>
+        <w:rPr>
+          <w:b/>
+        </w:rPr>
+        <w:t xml:space="preserve">Aucun</w:t>
+      </w:r>
+      <w:r>
+        <w:t xml:space="preserve"> ne passe le seuil sur les deux moitiés. Même les meilleurs groupes de relations ajoutées sont justes trop rarement : les ajouter ferait perdre plus qu'elles ne rapportent. On les écarte donc toutes. C'est la même règle que pour les entités ; elle donne simplement un résultat différent.</w:t>
+      </w:r>
+    </w:p>
+    <w:p>
+      <w:pPr/>
+      <w:r>
+        <w:rPr>
+          <w:b/>
+        </w:rPr>
+        <w:t xml:space="preserve">Pourquoi les relations ajoutées sont si souvent fausses.</w:t>
+      </w:r>
+      <w:r>
+        <w:t xml:space="preserve"> Une entité est un mot écrit dans le texte : on peut le retrouver et le recopier. Une relation est un </w:t>
+      </w:r>
+      <w:r>
+        <w:rPr>
+          <w:b/>
+        </w:rPr>
+        <w:t xml:space="preserve">lien</w:t>
+      </w:r>
+      <w:r>
+        <w:t xml:space="preserve"> entre deux mots ; le modèle doit comprendre que le texte établit ce lien. Quand on lui demande « ce qui manque », il prend deux entités réelles du compte rendu et les relie par un lien qui paraît médicalement logique, mais que le texte n'écrit pas. Exemples : une coloscopie présentée comme ayant montré une sinusite ; une HTA présentée comme cause d'un choc septique, alors que le texte dit seulement « HTA mal équilibrée ». Chaque mot existe, mais le lien est inventé : c'est exactement une hallucination de relation.</w:t>
       </w:r>
     </w:p>
     <w:p>
@@ -1797,7 +1967,7 @@
         <w:pStyle w:val="ListParagraph"/>
         <w:numPr>
           <w:ilvl w:val="0"/>
-          <w:numId w:val="7"/>
+          <w:numId w:val="8"/>
         </w:numPr>
       </w:pPr>
       <w:r>
@@ -1809,7 +1979,7 @@
         <w:pStyle w:val="ListParagraph"/>
         <w:numPr>
           <w:ilvl w:val="0"/>
-          <w:numId w:val="7"/>
+          <w:numId w:val="8"/>
         </w:numPr>
       </w:pPr>
       <w:r>
@@ -1821,7 +1991,7 @@
         <w:pStyle w:val="ListParagraph"/>
         <w:numPr>
           <w:ilvl w:val="0"/>
-          <w:numId w:val="7"/>
+          <w:numId w:val="8"/>
         </w:numPr>
       </w:pPr>
       <w:r>
@@ -1895,7 +2065,7 @@
         <w:pStyle w:val="ListParagraph"/>
         <w:numPr>
           <w:ilvl w:val="0"/>
-          <w:numId w:val="8"/>
+          <w:numId w:val="9"/>
         </w:numPr>
       </w:pPr>
       <w:r>
@@ -1913,7 +2083,7 @@
         <w:pStyle w:val="ListParagraph"/>
         <w:numPr>
           <w:ilvl w:val="0"/>
-          <w:numId w:val="8"/>
+          <w:numId w:val="9"/>
         </w:numPr>
       </w:pPr>
       <w:r>
@@ -1931,7 +2101,7 @@
         <w:pStyle w:val="ListParagraph"/>
         <w:numPr>
           <w:ilvl w:val="0"/>
-          <w:numId w:val="8"/>
+          <w:numId w:val="9"/>
         </w:numPr>
       </w:pPr>
       <w:r>
@@ -1973,7 +2143,7 @@
         <w:pStyle w:val="ListParagraph"/>
         <w:numPr>
           <w:ilvl w:val="0"/>
-          <w:numId w:val="9"/>
+          <w:numId w:val="10"/>
         </w:numPr>
       </w:pPr>
       <w:r>
@@ -1985,7 +2155,7 @@
         <w:pStyle w:val="ListParagraph"/>
         <w:numPr>
           <w:ilvl w:val="0"/>
-          <w:numId w:val="9"/>
+          <w:numId w:val="10"/>
         </w:numPr>
       </w:pPr>
       <w:r>
@@ -1997,7 +2167,7 @@
         <w:pStyle w:val="ListParagraph"/>
         <w:numPr>
           <w:ilvl w:val="0"/>
-          <w:numId w:val="9"/>
+          <w:numId w:val="10"/>
         </w:numPr>
       </w:pPr>
       <w:r>
@@ -2009,7 +2179,7 @@
         <w:pStyle w:val="ListParagraph"/>
         <w:numPr>
           <w:ilvl w:val="0"/>
-          <w:numId w:val="9"/>
+          <w:numId w:val="10"/>
         </w:numPr>
       </w:pPr>
       <w:r>
@@ -2110,7 +2280,7 @@
         <w:pStyle w:val="ListParagraph"/>
         <w:numPr>
           <w:ilvl w:val="0"/>
-          <w:numId w:val="10"/>
+          <w:numId w:val="11"/>
         </w:numPr>
       </w:pPr>
       <w:r>
@@ -2122,7 +2292,7 @@
         <w:pStyle w:val="ListParagraph"/>
         <w:numPr>
           <w:ilvl w:val="0"/>
-          <w:numId w:val="10"/>
+          <w:numId w:val="11"/>
         </w:numPr>
       </w:pPr>
       <w:r>
@@ -2134,7 +2304,7 @@
         <w:pStyle w:val="ListParagraph"/>
         <w:numPr>
           <w:ilvl w:val="0"/>
-          <w:numId w:val="10"/>
+          <w:numId w:val="11"/>
         </w:numPr>
       </w:pPr>
       <w:r>
@@ -2566,7 +2736,7 @@
         <w:pStyle w:val="ListParagraph"/>
         <w:numPr>
           <w:ilvl w:val="0"/>
-          <w:numId w:val="11"/>
+          <w:numId w:val="12"/>
         </w:numPr>
       </w:pPr>
       <w:r>
@@ -2584,7 +2754,7 @@
         <w:pStyle w:val="ListParagraph"/>
         <w:numPr>
           <w:ilvl w:val="0"/>
-          <w:numId w:val="11"/>
+          <w:numId w:val="12"/>
         </w:numPr>
       </w:pPr>
       <w:r>
@@ -2602,7 +2772,7 @@
         <w:pStyle w:val="ListParagraph"/>
         <w:numPr>
           <w:ilvl w:val="0"/>
-          <w:numId w:val="11"/>
+          <w:numId w:val="12"/>
         </w:numPr>
       </w:pPr>
       <w:r>
@@ -2620,7 +2790,7 @@
         <w:pStyle w:val="ListParagraph"/>
         <w:numPr>
           <w:ilvl w:val="0"/>
-          <w:numId w:val="11"/>
+          <w:numId w:val="12"/>
         </w:numPr>
       </w:pPr>
       <w:r>
@@ -2665,7 +2835,7 @@
         <w:pStyle w:val="ListParagraph"/>
         <w:numPr>
           <w:ilvl w:val="0"/>
-          <w:numId w:val="12"/>
+          <w:numId w:val="13"/>
         </w:numPr>
       </w:pPr>
       <w:r>
@@ -2677,7 +2847,7 @@
         <w:pStyle w:val="ListParagraph"/>
         <w:numPr>
           <w:ilvl w:val="0"/>
-          <w:numId w:val="12"/>
+          <w:numId w:val="13"/>
         </w:numPr>
       </w:pPr>
       <w:r>
@@ -2716,7 +2886,7 @@
         <w:pStyle w:val="ListParagraph"/>
         <w:numPr>
           <w:ilvl w:val="0"/>
-          <w:numId w:val="12"/>
+          <w:numId w:val="13"/>
         </w:numPr>
       </w:pPr>
       <w:r>
@@ -2755,7 +2925,7 @@
         <w:pStyle w:val="ListParagraph"/>
         <w:numPr>
           <w:ilvl w:val="0"/>
-          <w:numId w:val="13"/>
+          <w:numId w:val="14"/>
         </w:numPr>
       </w:pPr>
       <w:r>
@@ -2776,7 +2946,7 @@
         <w:pStyle w:val="ListParagraph"/>
         <w:numPr>
           <w:ilvl w:val="0"/>
-          <w:numId w:val="13"/>
+          <w:numId w:val="14"/>
         </w:numPr>
       </w:pPr>
       <w:r>
@@ -2797,7 +2967,7 @@
         <w:pStyle w:val="ListParagraph"/>
         <w:numPr>
           <w:ilvl w:val="0"/>
-          <w:numId w:val="13"/>
+          <w:numId w:val="14"/>
         </w:numPr>
       </w:pPr>
       <w:r>
@@ -2818,7 +2988,7 @@
         <w:pStyle w:val="ListParagraph"/>
         <w:numPr>
           <w:ilvl w:val="0"/>
-          <w:numId w:val="13"/>
+          <w:numId w:val="14"/>
         </w:numPr>
       </w:pPr>
       <w:r>
@@ -2898,7 +3068,7 @@
         <w:pStyle w:val="ListParagraph"/>
         <w:numPr>
           <w:ilvl w:val="0"/>
-          <w:numId w:val="14"/>
+          <w:numId w:val="15"/>
         </w:numPr>
       </w:pPr>
       <w:r>
@@ -2910,7 +3080,7 @@
         <w:pStyle w:val="ListParagraph"/>
         <w:numPr>
           <w:ilvl w:val="0"/>
-          <w:numId w:val="14"/>
+          <w:numId w:val="15"/>
         </w:numPr>
       </w:pPr>
       <w:r>
@@ -2922,7 +3092,7 @@
         <w:pStyle w:val="ListParagraph"/>
         <w:numPr>
           <w:ilvl w:val="0"/>
-          <w:numId w:val="14"/>
+          <w:numId w:val="15"/>
         </w:numPr>
       </w:pPr>
       <w:r>
@@ -2999,7 +3169,7 @@
         <w:pStyle w:val="ListParagraph"/>
         <w:numPr>
           <w:ilvl w:val="0"/>
-          <w:numId w:val="15"/>
+          <w:numId w:val="16"/>
         </w:numPr>
       </w:pPr>
       <w:r>
@@ -3011,7 +3181,7 @@
         <w:pStyle w:val="ListParagraph"/>
         <w:numPr>
           <w:ilvl w:val="0"/>
-          <w:numId w:val="15"/>
+          <w:numId w:val="16"/>
         </w:numPr>
       </w:pPr>
       <w:r>
@@ -3023,7 +3193,7 @@
         <w:pStyle w:val="ListParagraph"/>
         <w:numPr>
           <w:ilvl w:val="0"/>
-          <w:numId w:val="15"/>
+          <w:numId w:val="16"/>
         </w:numPr>
       </w:pPr>
       <w:r>
@@ -4020,7 +4190,7 @@
         <w:pStyle w:val="ListParagraph"/>
         <w:numPr>
           <w:ilvl w:val="0"/>
-          <w:numId w:val="16"/>
+          <w:numId w:val="17"/>
         </w:numPr>
       </w:pPr>
       <w:r>
@@ -4041,7 +4211,7 @@
         <w:pStyle w:val="ListParagraph"/>
         <w:numPr>
           <w:ilvl w:val="0"/>
-          <w:numId w:val="16"/>
+          <w:numId w:val="17"/>
         </w:numPr>
       </w:pPr>
       <w:r>
@@ -4074,7 +4244,7 @@
         <w:pStyle w:val="ListParagraph"/>
         <w:numPr>
           <w:ilvl w:val="0"/>
-          <w:numId w:val="17"/>
+          <w:numId w:val="18"/>
         </w:numPr>
       </w:pPr>
       <w:r>
@@ -4086,7 +4256,7 @@
         <w:pStyle w:val="ListParagraph"/>
         <w:numPr>
           <w:ilvl w:val="0"/>
-          <w:numId w:val="17"/>
+          <w:numId w:val="18"/>
         </w:numPr>
       </w:pPr>
       <w:r>
@@ -4098,7 +4268,7 @@
         <w:pStyle w:val="ListParagraph"/>
         <w:numPr>
           <w:ilvl w:val="0"/>
-          <w:numId w:val="17"/>
+          <w:numId w:val="18"/>
         </w:numPr>
       </w:pPr>
       <w:r>
@@ -4110,7 +4280,7 @@
         <w:pStyle w:val="ListParagraph"/>
         <w:numPr>
           <w:ilvl w:val="0"/>
-          <w:numId w:val="17"/>
+          <w:numId w:val="18"/>
         </w:numPr>
       </w:pPr>
       <w:r>
@@ -4122,7 +4292,7 @@
         <w:pStyle w:val="ListParagraph"/>
         <w:numPr>
           <w:ilvl w:val="0"/>
-          <w:numId w:val="17"/>
+          <w:numId w:val="18"/>
         </w:numPr>
       </w:pPr>
       <w:r>
@@ -4134,7 +4304,7 @@
         <w:pStyle w:val="ListParagraph"/>
         <w:numPr>
           <w:ilvl w:val="0"/>
-          <w:numId w:val="17"/>
+          <w:numId w:val="18"/>
         </w:numPr>
       </w:pPr>
       <w:r>
@@ -4146,7 +4316,7 @@
         <w:pStyle w:val="ListParagraph"/>
         <w:numPr>
           <w:ilvl w:val="0"/>
-          <w:numId w:val="17"/>
+          <w:numId w:val="18"/>
         </w:numPr>
       </w:pPr>
       <w:r>
@@ -4247,7 +4417,7 @@
         <w:pStyle w:val="ListParagraph"/>
         <w:numPr>
           <w:ilvl w:val="0"/>
-          <w:numId w:val="18"/>
+          <w:numId w:val="19"/>
         </w:numPr>
       </w:pPr>
       <w:r>
@@ -4259,7 +4429,7 @@
         <w:pStyle w:val="ListParagraph"/>
         <w:numPr>
           <w:ilvl w:val="0"/>
-          <w:numId w:val="18"/>
+          <w:numId w:val="19"/>
         </w:numPr>
       </w:pPr>
       <w:r>
@@ -4280,7 +4450,7 @@
         <w:pStyle w:val="ListParagraph"/>
         <w:numPr>
           <w:ilvl w:val="0"/>
-          <w:numId w:val="18"/>
+          <w:numId w:val="19"/>
         </w:numPr>
       </w:pPr>
       <w:r>
@@ -4301,7 +4471,7 @@
         <w:pStyle w:val="ListParagraph"/>
         <w:numPr>
           <w:ilvl w:val="0"/>
-          <w:numId w:val="19"/>
+          <w:numId w:val="20"/>
         </w:numPr>
       </w:pPr>
       <w:r>
@@ -4328,7 +4498,7 @@
         <w:pStyle w:val="ListParagraph"/>
         <w:numPr>
           <w:ilvl w:val="0"/>
-          <w:numId w:val="19"/>
+          <w:numId w:val="20"/>
         </w:numPr>
       </w:pPr>
       <w:r>
@@ -4346,7 +4516,7 @@
         <w:pStyle w:val="ListParagraph"/>
         <w:numPr>
           <w:ilvl w:val="0"/>
-          <w:numId w:val="19"/>
+          <w:numId w:val="20"/>
         </w:numPr>
       </w:pPr>
       <w:r>
@@ -4364,7 +4534,7 @@
         <w:pStyle w:val="ListParagraph"/>
         <w:numPr>
           <w:ilvl w:val="0"/>
-          <w:numId w:val="19"/>
+          <w:numId w:val="20"/>
         </w:numPr>
       </w:pPr>
       <w:r>
@@ -4488,7 +4658,7 @@
         <w:pStyle w:val="ListParagraph"/>
         <w:numPr>
           <w:ilvl w:val="0"/>
-          <w:numId w:val="20"/>
+          <w:numId w:val="21"/>
         </w:numPr>
       </w:pPr>
       <w:r>
@@ -4506,7 +4676,7 @@
         <w:pStyle w:val="ListParagraph"/>
         <w:numPr>
           <w:ilvl w:val="0"/>
-          <w:numId w:val="20"/>
+          <w:numId w:val="21"/>
         </w:numPr>
       </w:pPr>
       <w:r>
@@ -4524,7 +4694,7 @@
         <w:pStyle w:val="ListParagraph"/>
         <w:numPr>
           <w:ilvl w:val="0"/>
-          <w:numId w:val="20"/>
+          <w:numId w:val="21"/>
         </w:numPr>
       </w:pPr>
       <w:r>
@@ -4542,7 +4712,7 @@
         <w:pStyle w:val="ListParagraph"/>
         <w:numPr>
           <w:ilvl w:val="0"/>
-          <w:numId w:val="20"/>
+          <w:numId w:val="21"/>
         </w:numPr>
       </w:pPr>
       <w:r>
@@ -4560,7 +4730,7 @@
         <w:pStyle w:val="ListParagraph"/>
         <w:numPr>
           <w:ilvl w:val="0"/>
-          <w:numId w:val="20"/>
+          <w:numId w:val="21"/>
         </w:numPr>
       </w:pPr>
       <w:r>
@@ -4610,7 +4780,7 @@
         <w:pStyle w:val="ListParagraph"/>
         <w:numPr>
           <w:ilvl w:val="0"/>
-          <w:numId w:val="21"/>
+          <w:numId w:val="22"/>
         </w:numPr>
       </w:pPr>
       <w:r>
@@ -4622,7 +4792,7 @@
         <w:pStyle w:val="ListParagraph"/>
         <w:numPr>
           <w:ilvl w:val="0"/>
-          <w:numId w:val="21"/>
+          <w:numId w:val="22"/>
         </w:numPr>
       </w:pPr>
       <w:r>
@@ -4634,7 +4804,7 @@
         <w:pStyle w:val="ListParagraph"/>
         <w:numPr>
           <w:ilvl w:val="0"/>
-          <w:numId w:val="21"/>
+          <w:numId w:val="22"/>
         </w:numPr>
       </w:pPr>
       <w:r>
@@ -4646,7 +4816,7 @@
         <w:pStyle w:val="ListParagraph"/>
         <w:numPr>
           <w:ilvl w:val="0"/>
-          <w:numId w:val="21"/>
+          <w:numId w:val="22"/>
         </w:numPr>
       </w:pPr>
       <w:r>
@@ -4729,7 +4899,7 @@
         <w:pStyle w:val="ListParagraph"/>
         <w:numPr>
           <w:ilvl w:val="0"/>
-          <w:numId w:val="22"/>
+          <w:numId w:val="23"/>
         </w:numPr>
       </w:pPr>
       <w:r>
@@ -4741,7 +4911,7 @@
         <w:pStyle w:val="ListParagraph"/>
         <w:numPr>
           <w:ilvl w:val="0"/>
-          <w:numId w:val="22"/>
+          <w:numId w:val="23"/>
         </w:numPr>
       </w:pPr>
       <w:r>
@@ -4753,7 +4923,7 @@
         <w:pStyle w:val="ListParagraph"/>
         <w:numPr>
           <w:ilvl w:val="0"/>
-          <w:numId w:val="22"/>
+          <w:numId w:val="23"/>
         </w:numPr>
       </w:pPr>
       <w:r>
@@ -4765,7 +4935,7 @@
         <w:pStyle w:val="ListParagraph"/>
         <w:numPr>
           <w:ilvl w:val="0"/>
-          <w:numId w:val="22"/>
+          <w:numId w:val="23"/>
         </w:numPr>
       </w:pPr>
       <w:r>
@@ -4795,7 +4965,7 @@
         <w:pStyle w:val="ListParagraph"/>
         <w:numPr>
           <w:ilvl w:val="0"/>
-          <w:numId w:val="23"/>
+          <w:numId w:val="24"/>
         </w:numPr>
       </w:pPr>
       <w:r>
@@ -4807,7 +4977,7 @@
         <w:pStyle w:val="ListParagraph"/>
         <w:numPr>
           <w:ilvl w:val="0"/>
-          <w:numId w:val="23"/>
+          <w:numId w:val="24"/>
         </w:numPr>
       </w:pPr>
       <w:r>
@@ -4819,7 +4989,7 @@
         <w:pStyle w:val="ListParagraph"/>
         <w:numPr>
           <w:ilvl w:val="0"/>
-          <w:numId w:val="23"/>
+          <w:numId w:val="24"/>
         </w:numPr>
       </w:pPr>
       <w:r>
@@ -4860,7 +5030,7 @@
         <w:pStyle w:val="ListParagraph"/>
         <w:numPr>
           <w:ilvl w:val="0"/>
-          <w:numId w:val="24"/>
+          <w:numId w:val="25"/>
         </w:numPr>
       </w:pPr>
       <w:r>
@@ -4872,7 +5042,7 @@
         <w:pStyle w:val="ListParagraph"/>
         <w:numPr>
           <w:ilvl w:val="0"/>
-          <w:numId w:val="24"/>
+          <w:numId w:val="25"/>
         </w:numPr>
       </w:pPr>
       <w:r>
@@ -4884,7 +5054,7 @@
         <w:pStyle w:val="ListParagraph"/>
         <w:numPr>
           <w:ilvl w:val="0"/>
-          <w:numId w:val="24"/>
+          <w:numId w:val="25"/>
         </w:numPr>
       </w:pPr>
       <w:r>
@@ -4896,7 +5066,7 @@
         <w:pStyle w:val="ListParagraph"/>
         <w:numPr>
           <w:ilvl w:val="0"/>
-          <w:numId w:val="24"/>
+          <w:numId w:val="25"/>
         </w:numPr>
       </w:pPr>
       <w:r>
@@ -4908,7 +5078,7 @@
         <w:pStyle w:val="ListParagraph"/>
         <w:numPr>
           <w:ilvl w:val="0"/>
-          <w:numId w:val="24"/>
+          <w:numId w:val="25"/>
         </w:numPr>
       </w:pPr>
       <w:r>
@@ -4929,7 +5099,7 @@
         <w:pStyle w:val="ListParagraph"/>
         <w:numPr>
           <w:ilvl w:val="0"/>
-          <w:numId w:val="25"/>
+          <w:numId w:val="26"/>
         </w:numPr>
       </w:pPr>
       <w:r>
@@ -4947,7 +5117,7 @@
         <w:pStyle w:val="ListParagraph"/>
         <w:numPr>
           <w:ilvl w:val="0"/>
-          <w:numId w:val="25"/>
+          <w:numId w:val="26"/>
         </w:numPr>
       </w:pPr>
       <w:r>
@@ -4965,7 +5135,7 @@
         <w:pStyle w:val="ListParagraph"/>
         <w:numPr>
           <w:ilvl w:val="0"/>
-          <w:numId w:val="25"/>
+          <w:numId w:val="26"/>
         </w:numPr>
       </w:pPr>
       <w:r>
@@ -4983,7 +5153,7 @@
         <w:pStyle w:val="ListParagraph"/>
         <w:numPr>
           <w:ilvl w:val="0"/>
-          <w:numId w:val="25"/>
+          <w:numId w:val="26"/>
         </w:numPr>
       </w:pPr>
       <w:r>
@@ -5001,7 +5171,7 @@
         <w:pStyle w:val="ListParagraph"/>
         <w:numPr>
           <w:ilvl w:val="0"/>
-          <w:numId w:val="25"/>
+          <w:numId w:val="26"/>
         </w:numPr>
       </w:pPr>
       <w:r>
@@ -5019,7 +5189,7 @@
         <w:pStyle w:val="ListParagraph"/>
         <w:numPr>
           <w:ilvl w:val="0"/>
-          <w:numId w:val="25"/>
+          <w:numId w:val="26"/>
         </w:numPr>
       </w:pPr>
       <w:r>
@@ -6218,16 +6388,16 @@
     </w:lvlOverride>
   </w:num>
   <w:num w:numId="8">
-    <w:abstractNumId w:val="0"/>
+    <w:abstractNumId w:val="1"/>
+    <w:lvlOverride w:ilvl="0">
+      <w:startOverride w:val="1"/>
+    </w:lvlOverride>
   </w:num>
   <w:num w:numId="9">
     <w:abstractNumId w:val="0"/>
   </w:num>
   <w:num w:numId="10">
-    <w:abstractNumId w:val="1"/>
-    <w:lvlOverride w:ilvl="0">
-      <w:startOverride w:val="1"/>
-    </w:lvlOverride>
+    <w:abstractNumId w:val="0"/>
   </w:num>
   <w:num w:numId="11">
     <w:abstractNumId w:val="1"/>
@@ -6242,13 +6412,13 @@
     </w:lvlOverride>
   </w:num>
   <w:num w:numId="13">
-    <w:abstractNumId w:val="0"/>
-  </w:num>
-  <w:num w:numId="14">
     <w:abstractNumId w:val="1"/>
     <w:lvlOverride w:ilvl="0">
       <w:startOverride w:val="1"/>
     </w:lvlOverride>
+  </w:num>
+  <w:num w:numId="14">
+    <w:abstractNumId w:val="0"/>
   </w:num>
   <w:num w:numId="15">
     <w:abstractNumId w:val="1"/>
@@ -6257,16 +6427,16 @@
     </w:lvlOverride>
   </w:num>
   <w:num w:numId="16">
-    <w:abstractNumId w:val="0"/>
+    <w:abstractNumId w:val="1"/>
+    <w:lvlOverride w:ilvl="0">
+      <w:startOverride w:val="1"/>
+    </w:lvlOverride>
   </w:num>
   <w:num w:numId="17">
     <w:abstractNumId w:val="0"/>
   </w:num>
   <w:num w:numId="18">
-    <w:abstractNumId w:val="1"/>
-    <w:lvlOverride w:ilvl="0">
-      <w:startOverride w:val="1"/>
-    </w:lvlOverride>
+    <w:abstractNumId w:val="0"/>
   </w:num>
   <w:num w:numId="19">
     <w:abstractNumId w:val="1"/>
@@ -6275,13 +6445,13 @@
     </w:lvlOverride>
   </w:num>
   <w:num w:numId="20">
-    <w:abstractNumId w:val="0"/>
-  </w:num>
-  <w:num w:numId="21">
     <w:abstractNumId w:val="1"/>
     <w:lvlOverride w:ilvl="0">
       <w:startOverride w:val="1"/>
     </w:lvlOverride>
+  </w:num>
+  <w:num w:numId="21">
+    <w:abstractNumId w:val="0"/>
   </w:num>
   <w:num w:numId="22">
     <w:abstractNumId w:val="1"/>
@@ -6290,12 +6460,18 @@
     </w:lvlOverride>
   </w:num>
   <w:num w:numId="23">
-    <w:abstractNumId w:val="0"/>
+    <w:abstractNumId w:val="1"/>
+    <w:lvlOverride w:ilvl="0">
+      <w:startOverride w:val="1"/>
+    </w:lvlOverride>
   </w:num>
   <w:num w:numId="24">
     <w:abstractNumId w:val="0"/>
   </w:num>
   <w:num w:numId="25">
+    <w:abstractNumId w:val="0"/>
+  </w:num>
+  <w:num w:numId="26">
     <w:abstractNumId w:val="0"/>
   </w:num>
 </w:numbering>

</xml_diff>

<commit_message>
Document encadrante : mode precision explique pas a pas (schema, exemple, seuil, garanties)
Co-Authored-By: Claude Opus 5.5 <noreply@anthropic.com>
Claude-Session: https://claude.ai/code/session_01U1N2aa47apfcVip95LQDuG
</commit_message>
<xml_diff>
--- a/memoire/TRACE_reduction_hallucinations_explication.docx
+++ b/memoire/TRACE_reduction_hallucinations_explication.docx
@@ -5833,6 +5833,926 @@
         <w:pStyle w:val="Heading3"/>
       </w:pPr>
       <w:r>
+        <w:t xml:space="preserve">Le mode précision, pas à pas</w:t>
+      </w:r>
+    </w:p>
+    <w:p>
+      <w:pPr/>
+      <w:r>
+        <w:rPr>
+          <w:b/>
+        </w:rPr>
+        <w:t xml:space="preserve">En une phrase.</w:t>
+      </w:r>
+      <w:r>
+        <w:t xml:space="preserve"> Le mode précision, c'est le mode standard </w:t>
+      </w:r>
+      <w:r>
+        <w:rPr>
+          <w:b/>
+        </w:rPr>
+        <w:t xml:space="preserve">plus une étape de tri</w:t>
+      </w:r>
+      <w:r>
+        <w:t xml:space="preserve"> : après les règles, chaque élément encore présent reçoit un score, et les éléments au score le plus bas sont retirés.</w:t>
+      </w:r>
+    </w:p>
+    <w:p>
+      <w:pPr/>
+      <w:r>
+        <w:rPr>
+          <w:b/>
+        </w:rPr>
+        <w:t xml:space="preserve">Deux graphes livrés.</w:t>
+      </w:r>
+      <w:r>
+        <w:t xml:space="preserve"> TRACE part de la même sortie de l'étage 6 et produit deux graphes : un en mode standard, un en mode précision. On choisit celui qui convient à l'usage : le graphe standard pour garder le plus d'informations, le graphe précision quand une erreur coûte plus cher qu'un oubli.</w:t>
+      </w:r>
+    </w:p>
+    <w:p>
+      <w:pPr>
+        <w:pStyle w:val="Heading4"/>
+      </w:pPr>
+      <w:r>
+        <w:t xml:space="preserve">Avant : l'entraînement, une fois</w:t>
+      </w:r>
+    </w:p>
+    <w:p>
+      <w:pPr/>
+      <w:r>
+        <w:t xml:space="preserve">Le vote doit d'abord apprendre. C'est l'étage 8 qui s'en charge, parce que c'est le seul à lire le gold (voir l'étage 8). Il produit un fichier qui contient deux choses :</w:t>
+      </w:r>
+    </w:p>
+    <w:p>
+      <w:pPr>
+        <w:pStyle w:val="ListParagraph"/>
+        <w:numPr>
+          <w:ilvl w:val="0"/>
+          <w:numId w:val="29"/>
+        </w:numPr>
+      </w:pPr>
+      <w:r>
+        <w:rPr>
+          <w:b/>
+        </w:rPr>
+        <w:t xml:space="preserve">les poids</w:t>
+      </w:r>
+      <w:r>
+        <w:t xml:space="preserve"> : pour chaque indice, un nombre qui dit s'il pousse vers « juste » (positif) ou vers « faux » (négatif), et avec quelle force ;</w:t>
+      </w:r>
+    </w:p>
+    <w:p>
+      <w:pPr>
+        <w:pStyle w:val="ListParagraph"/>
+        <w:numPr>
+          <w:ilvl w:val="0"/>
+          <w:numId w:val="29"/>
+        </w:numPr>
+      </w:pPr>
+      <w:r>
+        <w:rPr>
+          <w:b/>
+        </w:rPr>
+        <w:t xml:space="preserve">les seuils</w:t>
+      </w:r>
+      <w:r>
+        <w:t xml:space="preserve"> : pour chaque part à garder possible, le score limite correspondant.</w:t>
+      </w:r>
+    </w:p>
+    <w:p>
+      <w:pPr/>
+      <w:r>
+        <w:t xml:space="preserve">Une fois ce fichier produit, l'étage 7 l'utilise sans jamais regarder le gold.</w:t>
+      </w:r>
+    </w:p>
+    <w:p>
+      <w:pPr>
+        <w:pStyle w:val="Heading4"/>
+      </w:pPr>
+      <w:r>
+        <w:t xml:space="preserve">Pendant : le parcours d'un élément</w:t>
+      </w:r>
+    </w:p>
+    <w:p>
+      <w:pPr/>
+      <w:r>
+        <w:drawing>
+          <wp:inline distT="0" distB="0" distL="0" distR="0">
+            <wp:extent cx="5486400" cy="3804557"/>
+            <wp:docPr id="2" name="image2" descr="parcours d'un élément en mode précision"/>
+            <a:graphic xmlns:a="http://schemas.openxmlformats.org/drawingml/2006/main">
+              <a:graphicData uri="http://schemas.openxmlformats.org/drawingml/2006/picture">
+                <pic:pic xmlns:pic="http://schemas.openxmlformats.org/drawingml/2006/picture">
+                  <pic:nvPicPr>
+                    <pic:cNvPr id="2" name="image2" descr="parcours d'un élément en mode précision"/>
+                    <pic:cNvPicPr/>
+                  </pic:nvPicPr>
+                  <pic:blipFill>
+                    <a:blip r:embed="rId4"/>
+                    <a:stretch>
+                      <a:fillRect/>
+                    </a:stretch>
+                  </pic:blipFill>
+                  <pic:spPr>
+                    <a:xfrm>
+                      <a:off x="0" y="0"/>
+                      <a:ext cx="5486400" cy="3804557"/>
+                    </a:xfrm>
+                    <a:prstGeom prst="rect">
+                      <a:avLst/>
+                    </a:prstGeom>
+                  </pic:spPr>
+                </pic:pic>
+              </a:graphicData>
+            </a:graphic>
+          </wp:inline>
+        </w:drawing>
+      </w:r>
+    </w:p>
+    <w:p>
+      <w:pPr/>
+      <w:r>
+        <w:t xml:space="preserve">parcours d'un élément en mode précision</w:t>
+      </w:r>
+    </w:p>
+    <w:p>
+      <w:pPr/>
+      <w:r>
+        <w:rPr>
+          <w:b/>
+        </w:rPr>
+        <w:t xml:space="preserve">Pour chaque entité</w:t>
+      </w:r>
+      <w:r>
+        <w:t xml:space="preserve">, dans cet ordre :</w:t>
+      </w:r>
+    </w:p>
+    <w:p>
+      <w:pPr>
+        <w:pStyle w:val="ListParagraph"/>
+        <w:numPr>
+          <w:ilvl w:val="0"/>
+          <w:numId w:val="30"/>
+        </w:numPr>
+      </w:pPr>
+      <w:r>
+        <w:t xml:space="preserve">On applique les règles E1, E2 et E3, exactement comme en mode standard. Si l'une s'applique, l'entité est retirée et le vote n'est même pas consulté.</w:t>
+      </w:r>
+    </w:p>
+    <w:p>
+      <w:pPr>
+        <w:pStyle w:val="ListParagraph"/>
+        <w:numPr>
+          <w:ilvl w:val="0"/>
+          <w:numId w:val="30"/>
+        </w:numPr>
+      </w:pPr>
+      <w:r>
+        <w:t xml:space="preserve">Sinon, on fait la liste de ses indices « oui » : son type, sa section, son type dans cette section, si elle est reliée, sa longueur, si elle contient un chiffre, ses mots…</w:t>
+      </w:r>
+    </w:p>
+    <w:p>
+      <w:pPr>
+        <w:pStyle w:val="ListParagraph"/>
+        <w:numPr>
+          <w:ilvl w:val="0"/>
+          <w:numId w:val="30"/>
+        </w:numPr>
+      </w:pPr>
+      <w:r>
+        <w:t xml:space="preserve">On additionne les poids de ces indices, puis on ramène la somme entre zéro et un : c'est son </w:t>
+      </w:r>
+      <w:r>
+        <w:rPr>
+          <w:b/>
+        </w:rPr>
+        <w:t xml:space="preserve">score</w:t>
+      </w:r>
+      <w:r>
+        <w:t xml:space="preserve">.</w:t>
+      </w:r>
+    </w:p>
+    <w:p>
+      <w:pPr>
+        <w:pStyle w:val="ListParagraph"/>
+        <w:numPr>
+          <w:ilvl w:val="0"/>
+          <w:numId w:val="30"/>
+        </w:numPr>
+      </w:pPr>
+      <w:r>
+        <w:t xml:space="preserve">On compare ce score au seuil de la part choisie.</w:t>
+      </w:r>
+    </w:p>
+    <w:p>
+      <w:pPr>
+        <w:pStyle w:val="ListParagraph"/>
+        <w:numPr>
+          <w:ilvl w:val="0"/>
+          <w:numId w:val="30"/>
+        </w:numPr>
+      </w:pPr>
+      <w:r>
+        <w:t xml:space="preserve">Si le score est </w:t>
+      </w:r>
+      <w:r>
+        <w:rPr>
+          <w:b/>
+        </w:rPr>
+        <w:t xml:space="preserve">sous</w:t>
+      </w:r>
+      <w:r>
+        <w:t xml:space="preserve"> le seuil, l'entité est retirée par la règle </w:t>
+      </w:r>
+      <w:r>
+        <w:rPr>
+          <w:b/>
+        </w:rPr>
+        <w:t xml:space="preserve">E4</w:t>
+      </w:r>
+      <w:r>
+        <w:t xml:space="preserve">. Sinon, elle est gardée.</w:t>
+      </w:r>
+    </w:p>
+    <w:p>
+      <w:pPr/>
+      <w:r>
+        <w:rPr>
+          <w:b/>
+        </w:rPr>
+        <w:t xml:space="preserve">Puis la cascade</w:t>
+      </w:r>
+      <w:r>
+        <w:t xml:space="preserve">, comme en mode standard : les relations d'une entité retirée de toutes les pages partent avec elle.</w:t>
+      </w:r>
+    </w:p>
+    <w:p>
+      <w:pPr/>
+      <w:r>
+        <w:rPr>
+          <w:b/>
+        </w:rPr>
+        <w:t xml:space="preserve">Pour chaque relation restante :</w:t>
+      </w:r>
+    </w:p>
+    <w:p>
+      <w:pPr>
+        <w:pStyle w:val="ListParagraph"/>
+        <w:numPr>
+          <w:ilvl w:val="0"/>
+          <w:numId w:val="31"/>
+        </w:numPr>
+      </w:pPr>
+      <w:r>
+        <w:t xml:space="preserve">On applique les règles R2 et R3, comme en mode standard.</w:t>
+      </w:r>
+    </w:p>
+    <w:p>
+      <w:pPr>
+        <w:pStyle w:val="ListParagraph"/>
+        <w:numPr>
+          <w:ilvl w:val="0"/>
+          <w:numId w:val="31"/>
+        </w:numPr>
+      </w:pPr>
+      <w:r>
+        <w:t xml:space="preserve">On calcule son score de la même façon, avec les indices propres aux relations : type de relation, preuve, distance, section, conformité au guideline, provenance, répétition, négation, hypothèse, mots…</w:t>
+      </w:r>
+    </w:p>
+    <w:p>
+      <w:pPr>
+        <w:pStyle w:val="ListParagraph"/>
+        <w:numPr>
+          <w:ilvl w:val="0"/>
+          <w:numId w:val="31"/>
+        </w:numPr>
+      </w:pPr>
+      <w:r>
+        <w:t xml:space="preserve">Si le score est sous le seuil, la relation est retirée par la règle </w:t>
+      </w:r>
+      <w:r>
+        <w:rPr>
+          <w:b/>
+        </w:rPr>
+        <w:t xml:space="preserve">R4</w:t>
+      </w:r>
+      <w:r>
+        <w:t xml:space="preserve">.</w:t>
+      </w:r>
+    </w:p>
+    <w:p>
+      <w:pPr>
+        <w:pStyle w:val="ListParagraph"/>
+        <w:numPr>
+          <w:ilvl w:val="0"/>
+          <w:numId w:val="31"/>
+        </w:numPr>
+      </w:pPr>
+      <w:r>
+        <w:t xml:space="preserve">Chaque relation gardée reçoit son niveau de confiance (haute, moyenne, basse), comme en mode standard.</w:t>
+      </w:r>
+    </w:p>
+    <w:p>
+      <w:pPr>
+        <w:pStyle w:val="Heading4"/>
+      </w:pPr>
+      <w:r>
+        <w:t xml:space="preserve">Un exemple déroulé</w:t>
+      </w:r>
+    </w:p>
+    <w:p>
+      <w:pPr/>
+      <w:r>
+        <w:t xml:space="preserve">On reprend l'exemple du compte rendu. Les effets indiqués sont ceux que le vote a appris ; on les décrit par leur sens plutôt que par leur valeur.</w:t>
+      </w:r>
+    </w:p>
+    <w:tbl>
+      <w:tblPr>
+        <w:tblStyle w:val="TableGrid"/>
+        <w:tblW w:w="0" w:type="auto"/>
+        <w:tblLayout w:type="fixed"/>
+        <w:tblLook w:val="04A0" w:firstRow="1" w:lastRow="0" w:firstColumn="0" w:lastColumn="0" w:noHBand="0" w:noVBand="1"/>
+      </w:tblPr>
+      <w:tblGrid>
+        <w:gridCol w:w="3436"/>
+        <w:gridCol w:w="2122"/>
+        <w:gridCol w:w="1980"/>
+        <w:gridCol w:w="1821"/>
+      </w:tblGrid>
+      <w:tr>
+        <w:trPr>
+          <w:tblHeader/>
+        </w:trPr>
+        <w:tc>
+          <w:tcPr>
+            <w:tcW w:w="3436" w:type="dxa"/>
+            <w:shd w:val="clear" w:color="auto" w:fill="F2F2F2"/>
+          </w:tcPr>
+          <w:p>
+            <w:pPr/>
+            <w:r>
+              <w:t xml:space="preserve">Élément</w:t>
+            </w:r>
+          </w:p>
+        </w:tc>
+        <w:tc>
+          <w:tcPr>
+            <w:tcW w:w="2122" w:type="dxa"/>
+            <w:shd w:val="clear" w:color="auto" w:fill="F2F2F2"/>
+          </w:tcPr>
+          <w:p>
+            <w:pPr/>
+            <w:r>
+              <w:t xml:space="preserve">Ses principaux indices</w:t>
+            </w:r>
+          </w:p>
+        </w:tc>
+        <w:tc>
+          <w:tcPr>
+            <w:tcW w:w="1980" w:type="dxa"/>
+            <w:shd w:val="clear" w:color="auto" w:fill="F2F2F2"/>
+          </w:tcPr>
+          <w:p>
+            <w:pPr/>
+            <w:r>
+              <w:t xml:space="preserve">Ce que chacun fait au score</w:t>
+            </w:r>
+          </w:p>
+        </w:tc>
+        <w:tc>
+          <w:tcPr>
+            <w:tcW w:w="1821" w:type="dxa"/>
+            <w:shd w:val="clear" w:color="auto" w:fill="F2F2F2"/>
+          </w:tcPr>
+          <w:p>
+            <w:pPr/>
+            <w:r>
+              <w:t xml:space="preserve">Résultat</w:t>
+            </w:r>
+          </w:p>
+        </w:tc>
+      </w:tr>
+      <w:tr>
+        <w:tc>
+          <w:tcPr>
+            <w:tcW w:w="3436" w:type="dxa"/>
+          </w:tcPr>
+          <w:p>
+            <w:pPr/>
+            <w:r>
+              <w:t xml:space="preserve">Relation « Scanner thoracique → objective → foyer lobaire inférieur droit »</w:t>
+            </w:r>
+          </w:p>
+        </w:tc>
+        <w:tc>
+          <w:tcPr>
+            <w:tcW w:w="2122" w:type="dxa"/>
+          </w:tcPr>
+          <w:p>
+            <w:pPr/>
+            <w:r>
+              <w:t xml:space="preserve">extraite directement ; termes sur la même ligne</w:t>
+            </w:r>
+          </w:p>
+        </w:tc>
+        <w:tc>
+          <w:tcPr>
+            <w:tcW w:w="1980" w:type="dxa"/>
+          </w:tcPr>
+          <w:p>
+            <w:pPr/>
+            <w:r>
+              <w:t xml:space="preserve">les deux poussent vers « juste »</w:t>
+            </w:r>
+          </w:p>
+        </w:tc>
+        <w:tc>
+          <w:tcPr>
+            <w:tcW w:w="1821" w:type="dxa"/>
+          </w:tcPr>
+          <w:p>
+            <w:pPr/>
+            <w:r>
+              <w:t xml:space="preserve">Score haut, au-dessus du seuil : </w:t>
+            </w:r>
+            <w:r>
+              <w:rPr>
+                <w:b/>
+              </w:rPr>
+              <w:t xml:space="preserve">gardée</w:t>
+            </w:r>
+          </w:p>
+        </w:tc>
+      </w:tr>
+      <w:tr>
+        <w:tc>
+          <w:tcPr>
+            <w:tcW w:w="3436" w:type="dxa"/>
+          </w:tcPr>
+          <w:p>
+            <w:pPr/>
+            <w:r>
+              <w:t xml:space="preserve">Relation répétant un fait déjà présent, dont l'entité suit une négation</w:t>
+            </w:r>
+          </w:p>
+        </w:tc>
+        <w:tc>
+          <w:tcPr>
+            <w:tcW w:w="2122" w:type="dxa"/>
+          </w:tcPr>
+          <w:p>
+            <w:pPr/>
+            <w:r>
+              <w:t xml:space="preserve">doublon ; négation</w:t>
+            </w:r>
+          </w:p>
+        </w:tc>
+        <w:tc>
+          <w:tcPr>
+            <w:tcW w:w="1980" w:type="dxa"/>
+          </w:tcPr>
+          <w:p>
+            <w:pPr/>
+            <w:r>
+              <w:t xml:space="preserve">les deux poussent nettement vers « faux »</w:t>
+            </w:r>
+          </w:p>
+        </w:tc>
+        <w:tc>
+          <w:tcPr>
+            <w:tcW w:w="1821" w:type="dxa"/>
+          </w:tcPr>
+          <w:p>
+            <w:pPr/>
+            <w:r>
+              <w:t xml:space="preserve">Score bas, sous le seuil : </w:t>
+            </w:r>
+            <w:r>
+              <w:rPr>
+                <w:b/>
+              </w:rPr>
+              <w:t xml:space="preserve">retirée par R4</w:t>
+            </w:r>
+          </w:p>
+        </w:tc>
+      </w:tr>
+      <w:tr>
+        <w:tc>
+          <w:tcPr>
+            <w:tcW w:w="3436" w:type="dxa"/>
+          </w:tcPr>
+          <w:p>
+            <w:pPr/>
+            <w:r>
+              <w:t xml:space="preserve">Entité « Leucocytes 18.2 4.0-10.0 G/L »</w:t>
+            </w:r>
+          </w:p>
+        </w:tc>
+        <w:tc>
+          <w:tcPr>
+            <w:tcW w:w="2122" w:type="dxa"/>
+          </w:tcPr>
+          <w:p>
+            <w:pPr/>
+            <w:r>
+              <w:t xml:space="preserve">biomarqueur ; contient sa valeur ; dans la biologie</w:t>
+            </w:r>
+          </w:p>
+        </w:tc>
+        <w:tc>
+          <w:tcPr>
+            <w:tcW w:w="1980" w:type="dxa"/>
+          </w:tcPr>
+          <w:p>
+            <w:pPr/>
+            <w:r>
+              <w:t xml:space="preserve">poussent vers « juste »</w:t>
+            </w:r>
+          </w:p>
+        </w:tc>
+        <w:tc>
+          <w:tcPr>
+            <w:tcW w:w="1821" w:type="dxa"/>
+          </w:tcPr>
+          <w:p>
+            <w:pPr/>
+            <w:r>
+              <w:rPr>
+                <w:b/>
+              </w:rPr>
+              <w:t xml:space="preserve">Gardée</w:t>
+            </w:r>
+          </w:p>
+        </w:tc>
+      </w:tr>
+      <w:tr>
+        <w:tc>
+          <w:tcPr>
+            <w:tcW w:w="3436" w:type="dxa"/>
+          </w:tcPr>
+          <w:p>
+            <w:pPr/>
+            <w:r>
+              <w:t xml:space="preserve">Entité traitement contenant une dose, sur une ligne où la posologie a été fusionnée</w:t>
+            </w:r>
+          </w:p>
+        </w:tc>
+        <w:tc>
+          <w:tcPr>
+            <w:tcW w:w="2122" w:type="dxa"/>
+          </w:tcPr>
+          <w:p>
+            <w:pPr/>
+            <w:r>
+              <w:t xml:space="preserve">traitement avec un chiffre</w:t>
+            </w:r>
+          </w:p>
+        </w:tc>
+        <w:tc>
+          <w:tcPr>
+            <w:tcW w:w="1980" w:type="dxa"/>
+          </w:tcPr>
+          <w:p>
+            <w:pPr/>
+            <w:r>
+              <w:t xml:space="preserve">pousse vers « faux »</w:t>
+            </w:r>
+          </w:p>
+        </w:tc>
+        <w:tc>
+          <w:tcPr>
+            <w:tcW w:w="1821" w:type="dxa"/>
+          </w:tcPr>
+          <w:p>
+            <w:pPr/>
+            <w:r>
+              <w:t xml:space="preserve">Si rien d'autre ne compense : </w:t>
+            </w:r>
+            <w:r>
+              <w:rPr>
+                <w:b/>
+              </w:rPr>
+              <w:t xml:space="preserve">retirée par E4</w:t>
+            </w:r>
+          </w:p>
+        </w:tc>
+      </w:tr>
+    </w:tbl>
+    <w:p>
+      <w:pPr/>
+      <w:r>
+        <w:t xml:space="preserve">C'est le cumul qui compte : un élément peut porter un indice défavorable et rester au-dessus du seuil si ses autres indices sont très favorables.</w:t>
+      </w:r>
+    </w:p>
+    <w:p>
+      <w:pPr>
+        <w:pStyle w:val="Heading4"/>
+      </w:pPr>
+      <w:r>
+        <w:t xml:space="preserve">Comment se lit le seuil</w:t>
+      </w:r>
+    </w:p>
+    <w:p>
+      <w:pPr/>
+      <w:r>
+        <w:t xml:space="preserve">Imaginons tous les éléments d'apprentissage rangés du score le plus bas au plus haut. Choisir de garder les quatre cinquièmes, c'est couper la file à l'endroit où commence le cinquième le plus bas. Le score à cet endroit est le </w:t>
+      </w:r>
+      <w:r>
+        <w:rPr>
+          <w:b/>
+        </w:rPr>
+        <w:t xml:space="preserve">seuil</w:t>
+      </w:r>
+      <w:r>
+        <w:t xml:space="preserve">. Un nouvel élément est comparé à ce point de coupe : en dessous, il ressemble aux éléments les plus douteux, et il est retiré.</w:t>
+      </w:r>
+    </w:p>
+    <w:p>
+      <w:pPr>
+        <w:pStyle w:val="Heading4"/>
+      </w:pPr>
+      <w:r>
+        <w:t xml:space="preserve">Comment choisir la part à garder</w:t>
+      </w:r>
+    </w:p>
+    <w:tbl>
+      <w:tblPr>
+        <w:tblStyle w:val="TableGrid"/>
+        <w:tblW w:w="0" w:type="auto"/>
+        <w:tblLayout w:type="fixed"/>
+        <w:tblLook w:val="04A0" w:firstRow="1" w:lastRow="0" w:firstColumn="0" w:lastColumn="0" w:noHBand="0" w:noVBand="1"/>
+      </w:tblPr>
+      <w:tblGrid>
+        <w:gridCol w:w="1764"/>
+        <w:gridCol w:w="2182"/>
+        <w:gridCol w:w="3098"/>
+        <w:gridCol w:w="2315"/>
+      </w:tblGrid>
+      <w:tr>
+        <w:trPr>
+          <w:tblHeader/>
+        </w:trPr>
+        <w:tc>
+          <w:tcPr>
+            <w:tcW w:w="1764" w:type="dxa"/>
+            <w:shd w:val="clear" w:color="auto" w:fill="F2F2F2"/>
+          </w:tcPr>
+          <w:p>
+            <w:pPr/>
+            <w:r>
+              <w:t xml:space="preserve">Part gardée</w:t>
+            </w:r>
+          </w:p>
+        </w:tc>
+        <w:tc>
+          <w:tcPr>
+            <w:tcW w:w="2182" w:type="dxa"/>
+            <w:shd w:val="clear" w:color="auto" w:fill="F2F2F2"/>
+          </w:tcPr>
+          <w:p>
+            <w:pPr/>
+            <w:r>
+              <w:t xml:space="preserve">Effet sur les hallucinations</w:t>
+            </w:r>
+          </w:p>
+        </w:tc>
+        <w:tc>
+          <w:tcPr>
+            <w:tcW w:w="3098" w:type="dxa"/>
+            <w:shd w:val="clear" w:color="auto" w:fill="F2F2F2"/>
+          </w:tcPr>
+          <w:p>
+            <w:pPr/>
+            <w:r>
+              <w:t xml:space="preserve">Effet sur les oublis</w:t>
+            </w:r>
+          </w:p>
+        </w:tc>
+        <w:tc>
+          <w:tcPr>
+            <w:tcW w:w="2315" w:type="dxa"/>
+            <w:shd w:val="clear" w:color="auto" w:fill="F2F2F2"/>
+          </w:tcPr>
+          <w:p>
+            <w:pPr/>
+            <w:r>
+              <w:t xml:space="preserve">Usage</w:t>
+            </w:r>
+          </w:p>
+        </w:tc>
+      </w:tr>
+      <w:tr>
+        <w:tc>
+          <w:tcPr>
+            <w:tcW w:w="1764" w:type="dxa"/>
+          </w:tcPr>
+          <w:p>
+            <w:pPr/>
+            <w:r>
+              <w:t xml:space="preserve">Presque tout</w:t>
+            </w:r>
+          </w:p>
+        </w:tc>
+        <w:tc>
+          <w:tcPr>
+            <w:tcW w:w="2182" w:type="dxa"/>
+          </w:tcPr>
+          <w:p>
+            <w:pPr/>
+            <w:r>
+              <w:t xml:space="preserve">Légère baisse</w:t>
+            </w:r>
+          </w:p>
+        </w:tc>
+        <w:tc>
+          <w:tcPr>
+            <w:tcW w:w="3098" w:type="dxa"/>
+          </w:tcPr>
+          <w:p>
+            <w:pPr/>
+            <w:r>
+              <w:t xml:space="preserve">Presque aucun oubli ajouté</w:t>
+            </w:r>
+          </w:p>
+        </w:tc>
+        <w:tc>
+          <w:tcPr>
+            <w:tcW w:w="2315" w:type="dxa"/>
+          </w:tcPr>
+          <w:p>
+            <w:pPr/>
+            <w:r>
+              <w:t xml:space="preserve">Améliorer sans rien perdre</w:t>
+            </w:r>
+          </w:p>
+        </w:tc>
+      </w:tr>
+      <w:tr>
+        <w:tc>
+          <w:tcPr>
+            <w:tcW w:w="1764" w:type="dxa"/>
+          </w:tcPr>
+          <w:p>
+            <w:pPr/>
+            <w:r>
+              <w:t xml:space="preserve">Les quatre cinquièmes (défaut)</w:t>
+            </w:r>
+          </w:p>
+        </w:tc>
+        <w:tc>
+          <w:tcPr>
+            <w:tcW w:w="2182" w:type="dxa"/>
+          </w:tcPr>
+          <w:p>
+            <w:pPr/>
+            <w:r>
+              <w:t xml:space="preserve">Nette baisse</w:t>
+            </w:r>
+          </w:p>
+        </w:tc>
+        <w:tc>
+          <w:tcPr>
+            <w:tcW w:w="3098" w:type="dxa"/>
+          </w:tcPr>
+          <w:p>
+            <w:pPr/>
+            <w:r>
+              <w:t xml:space="preserve">Quelques éléments justes perdus</w:t>
+            </w:r>
+          </w:p>
+        </w:tc>
+        <w:tc>
+          <w:tcPr>
+            <w:tcW w:w="2315" w:type="dxa"/>
+          </w:tcPr>
+          <w:p>
+            <w:pPr/>
+            <w:r>
+              <w:t xml:space="preserve">Bon compromis</w:t>
+            </w:r>
+          </w:p>
+        </w:tc>
+      </w:tr>
+      <w:tr>
+        <w:tc>
+          <w:tcPr>
+            <w:tcW w:w="1764" w:type="dxa"/>
+          </w:tcPr>
+          <w:p>
+            <w:pPr/>
+            <w:r>
+              <w:t xml:space="preserve">Moins</w:t>
+            </w:r>
+          </w:p>
+        </w:tc>
+        <w:tc>
+          <w:tcPr>
+            <w:tcW w:w="2182" w:type="dxa"/>
+          </w:tcPr>
+          <w:p>
+            <w:pPr/>
+            <w:r>
+              <w:t xml:space="preserve">Baisse encore plus forte</w:t>
+            </w:r>
+          </w:p>
+        </w:tc>
+        <w:tc>
+          <w:tcPr>
+            <w:tcW w:w="3098" w:type="dxa"/>
+          </w:tcPr>
+          <w:p>
+            <w:pPr/>
+            <w:r>
+              <w:t xml:space="preserve">Beaucoup d'éléments justes perdus</w:t>
+            </w:r>
+          </w:p>
+        </w:tc>
+        <w:tc>
+          <w:tcPr>
+            <w:tcW w:w="2315" w:type="dxa"/>
+          </w:tcPr>
+          <w:p>
+            <w:pPr/>
+            <w:r>
+              <w:t xml:space="preserve">Quand toute erreur est inacceptable</w:t>
+            </w:r>
+          </w:p>
+        </w:tc>
+      </w:tr>
+    </w:tbl>
+    <w:p>
+      <w:pPr/>
+      <w:r>
+        <w:t xml:space="preserve">Le choix ne se fait pas à l'aveugle : l'étage 8 mesure l'effet de chaque part sur des documents que le vote n'a jamais vus (validation croisée).</w:t>
+      </w:r>
+    </w:p>
+    <w:p>
+      <w:pPr>
+        <w:pStyle w:val="Heading4"/>
+      </w:pPr>
+      <w:r>
+        <w:t xml:space="preserve">Ce que le mode précision garantit</w:t>
+      </w:r>
+    </w:p>
+    <w:p>
+      <w:pPr>
+        <w:pStyle w:val="ListParagraph"/>
+        <w:numPr>
+          <w:ilvl w:val="0"/>
+          <w:numId w:val="32"/>
+        </w:numPr>
+      </w:pPr>
+      <w:r>
+        <w:rPr>
+          <w:b/>
+        </w:rPr>
+        <w:t xml:space="preserve">Il ne repêche jamais.</w:t>
+      </w:r>
+      <w:r>
+        <w:t xml:space="preserve"> Un élément retiré par une règle du mode standard reste retiré. Le graphe précision est donc toujours contenu dans le graphe standard.</w:t>
+      </w:r>
+    </w:p>
+    <w:p>
+      <w:pPr>
+        <w:pStyle w:val="ListParagraph"/>
+        <w:numPr>
+          <w:ilvl w:val="0"/>
+          <w:numId w:val="32"/>
+        </w:numPr>
+      </w:pPr>
+      <w:r>
+        <w:rPr>
+          <w:b/>
+        </w:rPr>
+        <w:t xml:space="preserve">Il ne crée rien et ne corrige rien.</w:t>
+      </w:r>
+      <w:r>
+        <w:t xml:space="preserve"> Il n'ajoute aucun élément, ne change aucun type, ne modifie aucun lien : il trie seulement.</w:t>
+      </w:r>
+    </w:p>
+    <w:p>
+      <w:pPr>
+        <w:pStyle w:val="ListParagraph"/>
+        <w:numPr>
+          <w:ilvl w:val="0"/>
+          <w:numId w:val="32"/>
+        </w:numPr>
+      </w:pPr>
+      <w:r>
+        <w:rPr>
+          <w:b/>
+        </w:rPr>
+        <w:t xml:space="preserve">Il reste explicable.</w:t>
+      </w:r>
+      <w:r>
+        <w:t xml:space="preserve"> Pour un élément retiré par E4 ou R4, on peut lister les indices qui ont fait baisser son score.</w:t>
+      </w:r>
+    </w:p>
+    <w:p>
+      <w:pPr>
+        <w:pStyle w:val="Heading3"/>
+      </w:pPr>
+      <w:r>
         <w:t xml:space="preserve">Ce que l'étage 7 écrit pour chaque élément</w:t>
       </w:r>
     </w:p>
@@ -5847,7 +6767,7 @@
         <w:pStyle w:val="ListParagraph"/>
         <w:numPr>
           <w:ilvl w:val="0"/>
-          <w:numId w:val="29"/>
+          <w:numId w:val="33"/>
         </w:numPr>
       </w:pPr>
       <w:r>
@@ -5859,7 +6779,7 @@
         <w:pStyle w:val="ListParagraph"/>
         <w:numPr>
           <w:ilvl w:val="0"/>
-          <w:numId w:val="29"/>
+          <w:numId w:val="33"/>
         </w:numPr>
       </w:pPr>
       <w:r>
@@ -5871,7 +6791,7 @@
         <w:pStyle w:val="ListParagraph"/>
         <w:numPr>
           <w:ilvl w:val="0"/>
-          <w:numId w:val="29"/>
+          <w:numId w:val="33"/>
         </w:numPr>
       </w:pPr>
       <w:r>
@@ -5883,7 +6803,7 @@
         <w:pStyle w:val="ListParagraph"/>
         <w:numPr>
           <w:ilvl w:val="0"/>
-          <w:numId w:val="29"/>
+          <w:numId w:val="33"/>
         </w:numPr>
       </w:pPr>
       <w:r>
@@ -5895,7 +6815,7 @@
         <w:pStyle w:val="ListParagraph"/>
         <w:numPr>
           <w:ilvl w:val="0"/>
-          <w:numId w:val="29"/>
+          <w:numId w:val="33"/>
         </w:numPr>
       </w:pPr>
       <w:r>
@@ -6251,7 +7171,7 @@
         <w:pStyle w:val="ListParagraph"/>
         <w:numPr>
           <w:ilvl w:val="0"/>
-          <w:numId w:val="30"/>
+          <w:numId w:val="34"/>
         </w:numPr>
       </w:pPr>
       <w:r>
@@ -6263,7 +7183,7 @@
         <w:pStyle w:val="ListParagraph"/>
         <w:numPr>
           <w:ilvl w:val="0"/>
-          <w:numId w:val="30"/>
+          <w:numId w:val="34"/>
         </w:numPr>
       </w:pPr>
       <w:r>
@@ -6275,7 +7195,7 @@
         <w:pStyle w:val="ListParagraph"/>
         <w:numPr>
           <w:ilvl w:val="0"/>
-          <w:numId w:val="30"/>
+          <w:numId w:val="34"/>
         </w:numPr>
       </w:pPr>
       <w:r>
@@ -6287,7 +7207,7 @@
         <w:pStyle w:val="ListParagraph"/>
         <w:numPr>
           <w:ilvl w:val="0"/>
-          <w:numId w:val="30"/>
+          <w:numId w:val="34"/>
         </w:numPr>
       </w:pPr>
       <w:r>
@@ -6823,7 +7743,7 @@
         <w:pStyle w:val="ListParagraph"/>
         <w:numPr>
           <w:ilvl w:val="0"/>
-          <w:numId w:val="31"/>
+          <w:numId w:val="35"/>
         </w:numPr>
       </w:pPr>
       <w:r>
@@ -6841,7 +7761,7 @@
         <w:pStyle w:val="ListParagraph"/>
         <w:numPr>
           <w:ilvl w:val="0"/>
-          <w:numId w:val="31"/>
+          <w:numId w:val="35"/>
         </w:numPr>
       </w:pPr>
       <w:r>
@@ -6859,7 +7779,7 @@
         <w:pStyle w:val="ListParagraph"/>
         <w:numPr>
           <w:ilvl w:val="0"/>
-          <w:numId w:val="31"/>
+          <w:numId w:val="35"/>
         </w:numPr>
       </w:pPr>
       <w:r>
@@ -6877,7 +7797,7 @@
         <w:pStyle w:val="ListParagraph"/>
         <w:numPr>
           <w:ilvl w:val="0"/>
-          <w:numId w:val="31"/>
+          <w:numId w:val="35"/>
         </w:numPr>
       </w:pPr>
       <w:r>
@@ -6895,7 +7815,7 @@
         <w:pStyle w:val="ListParagraph"/>
         <w:numPr>
           <w:ilvl w:val="0"/>
-          <w:numId w:val="31"/>
+          <w:numId w:val="35"/>
         </w:numPr>
       </w:pPr>
       <w:r>
@@ -6945,7 +7865,7 @@
         <w:pStyle w:val="ListParagraph"/>
         <w:numPr>
           <w:ilvl w:val="0"/>
-          <w:numId w:val="32"/>
+          <w:numId w:val="36"/>
         </w:numPr>
       </w:pPr>
       <w:r>
@@ -6957,7 +7877,7 @@
         <w:pStyle w:val="ListParagraph"/>
         <w:numPr>
           <w:ilvl w:val="0"/>
-          <w:numId w:val="32"/>
+          <w:numId w:val="36"/>
         </w:numPr>
       </w:pPr>
       <w:r>
@@ -6969,7 +7889,7 @@
         <w:pStyle w:val="ListParagraph"/>
         <w:numPr>
           <w:ilvl w:val="0"/>
-          <w:numId w:val="32"/>
+          <w:numId w:val="36"/>
         </w:numPr>
       </w:pPr>
       <w:r>
@@ -6990,7 +7910,7 @@
         <w:pStyle w:val="ListParagraph"/>
         <w:numPr>
           <w:ilvl w:val="0"/>
-          <w:numId w:val="32"/>
+          <w:numId w:val="36"/>
         </w:numPr>
       </w:pPr>
       <w:r>
@@ -7002,7 +7922,7 @@
         <w:pStyle w:val="ListParagraph"/>
         <w:numPr>
           <w:ilvl w:val="0"/>
-          <w:numId w:val="32"/>
+          <w:numId w:val="36"/>
         </w:numPr>
       </w:pPr>
       <w:r>
@@ -7014,7 +7934,7 @@
         <w:pStyle w:val="ListParagraph"/>
         <w:numPr>
           <w:ilvl w:val="0"/>
-          <w:numId w:val="32"/>
+          <w:numId w:val="36"/>
         </w:numPr>
       </w:pPr>
       <w:r>
@@ -7130,7 +8050,7 @@
         <w:pStyle w:val="ListParagraph"/>
         <w:numPr>
           <w:ilvl w:val="0"/>
-          <w:numId w:val="33"/>
+          <w:numId w:val="37"/>
         </w:numPr>
       </w:pPr>
       <w:r>
@@ -7142,7 +8062,7 @@
         <w:pStyle w:val="ListParagraph"/>
         <w:numPr>
           <w:ilvl w:val="0"/>
-          <w:numId w:val="33"/>
+          <w:numId w:val="37"/>
         </w:numPr>
       </w:pPr>
       <w:r>
@@ -7154,7 +8074,7 @@
         <w:pStyle w:val="ListParagraph"/>
         <w:numPr>
           <w:ilvl w:val="0"/>
-          <w:numId w:val="33"/>
+          <w:numId w:val="37"/>
         </w:numPr>
       </w:pPr>
       <w:r>
@@ -7166,7 +8086,7 @@
         <w:pStyle w:val="ListParagraph"/>
         <w:numPr>
           <w:ilvl w:val="0"/>
-          <w:numId w:val="33"/>
+          <w:numId w:val="37"/>
         </w:numPr>
       </w:pPr>
       <w:r>
@@ -7196,7 +8116,7 @@
         <w:pStyle w:val="ListParagraph"/>
         <w:numPr>
           <w:ilvl w:val="0"/>
-          <w:numId w:val="34"/>
+          <w:numId w:val="38"/>
         </w:numPr>
       </w:pPr>
       <w:r>
@@ -7208,7 +8128,7 @@
         <w:pStyle w:val="ListParagraph"/>
         <w:numPr>
           <w:ilvl w:val="0"/>
-          <w:numId w:val="34"/>
+          <w:numId w:val="38"/>
         </w:numPr>
       </w:pPr>
       <w:r>
@@ -7220,7 +8140,7 @@
         <w:pStyle w:val="ListParagraph"/>
         <w:numPr>
           <w:ilvl w:val="0"/>
-          <w:numId w:val="34"/>
+          <w:numId w:val="38"/>
         </w:numPr>
       </w:pPr>
       <w:r>
@@ -7261,7 +8181,7 @@
         <w:pStyle w:val="ListParagraph"/>
         <w:numPr>
           <w:ilvl w:val="0"/>
-          <w:numId w:val="35"/>
+          <w:numId w:val="39"/>
         </w:numPr>
       </w:pPr>
       <w:r>
@@ -7273,7 +8193,7 @@
         <w:pStyle w:val="ListParagraph"/>
         <w:numPr>
           <w:ilvl w:val="0"/>
-          <w:numId w:val="35"/>
+          <w:numId w:val="39"/>
         </w:numPr>
       </w:pPr>
       <w:r>
@@ -7285,7 +8205,7 @@
         <w:pStyle w:val="ListParagraph"/>
         <w:numPr>
           <w:ilvl w:val="0"/>
-          <w:numId w:val="35"/>
+          <w:numId w:val="39"/>
         </w:numPr>
       </w:pPr>
       <w:r>
@@ -7297,7 +8217,7 @@
         <w:pStyle w:val="ListParagraph"/>
         <w:numPr>
           <w:ilvl w:val="0"/>
-          <w:numId w:val="35"/>
+          <w:numId w:val="39"/>
         </w:numPr>
       </w:pPr>
       <w:r>
@@ -7309,7 +8229,7 @@
         <w:pStyle w:val="ListParagraph"/>
         <w:numPr>
           <w:ilvl w:val="0"/>
-          <w:numId w:val="35"/>
+          <w:numId w:val="39"/>
         </w:numPr>
       </w:pPr>
       <w:r>
@@ -7330,7 +8250,7 @@
         <w:pStyle w:val="ListParagraph"/>
         <w:numPr>
           <w:ilvl w:val="0"/>
-          <w:numId w:val="36"/>
+          <w:numId w:val="40"/>
         </w:numPr>
       </w:pPr>
       <w:r>
@@ -7348,7 +8268,7 @@
         <w:pStyle w:val="ListParagraph"/>
         <w:numPr>
           <w:ilvl w:val="0"/>
-          <w:numId w:val="36"/>
+          <w:numId w:val="40"/>
         </w:numPr>
       </w:pPr>
       <w:r>
@@ -7366,7 +8286,7 @@
         <w:pStyle w:val="ListParagraph"/>
         <w:numPr>
           <w:ilvl w:val="0"/>
-          <w:numId w:val="36"/>
+          <w:numId w:val="40"/>
         </w:numPr>
       </w:pPr>
       <w:r>
@@ -7384,7 +8304,7 @@
         <w:pStyle w:val="ListParagraph"/>
         <w:numPr>
           <w:ilvl w:val="0"/>
-          <w:numId w:val="36"/>
+          <w:numId w:val="40"/>
         </w:numPr>
       </w:pPr>
       <w:r>
@@ -7402,7 +8322,7 @@
         <w:pStyle w:val="ListParagraph"/>
         <w:numPr>
           <w:ilvl w:val="0"/>
-          <w:numId w:val="36"/>
+          <w:numId w:val="40"/>
         </w:numPr>
       </w:pPr>
       <w:r>
@@ -7420,7 +8340,7 @@
         <w:pStyle w:val="ListParagraph"/>
         <w:numPr>
           <w:ilvl w:val="0"/>
-          <w:numId w:val="36"/>
+          <w:numId w:val="40"/>
         </w:numPr>
       </w:pPr>
       <w:r>
@@ -8724,24 +9644,42 @@
     </w:lvlOverride>
   </w:num>
   <w:num w:numId="32">
+    <w:abstractNumId w:val="0"/>
+  </w:num>
+  <w:num w:numId="33">
+    <w:abstractNumId w:val="0"/>
+  </w:num>
+  <w:num w:numId="34">
     <w:abstractNumId w:val="1"/>
     <w:lvlOverride w:ilvl="0">
       <w:startOverride w:val="1"/>
     </w:lvlOverride>
   </w:num>
-  <w:num w:numId="33">
+  <w:num w:numId="35">
     <w:abstractNumId w:val="1"/>
     <w:lvlOverride w:ilvl="0">
       <w:startOverride w:val="1"/>
     </w:lvlOverride>
   </w:num>
-  <w:num w:numId="34">
+  <w:num w:numId="36">
+    <w:abstractNumId w:val="1"/>
+    <w:lvlOverride w:ilvl="0">
+      <w:startOverride w:val="1"/>
+    </w:lvlOverride>
+  </w:num>
+  <w:num w:numId="37">
+    <w:abstractNumId w:val="1"/>
+    <w:lvlOverride w:ilvl="0">
+      <w:startOverride w:val="1"/>
+    </w:lvlOverride>
+  </w:num>
+  <w:num w:numId="38">
     <w:abstractNumId w:val="0"/>
   </w:num>
-  <w:num w:numId="35">
+  <w:num w:numId="39">
     <w:abstractNumId w:val="0"/>
   </w:num>
-  <w:num w:numId="36">
+  <w:num w:numId="40">
     <w:abstractNumId w:val="0"/>
   </w:num>
 </w:numbering>

</xml_diff>